<commit_message>
Ch 10 (States of Matter): factor-label rewrites for the 9 numerical Solutions
Specific-heat arithmetic (q = mcΔT, both forward and inverted to solve
for c or for ΔT), water/iron temperature comparison, and the 1.00 kg
water-to-ice volume expansion now show cancelled units as Word
strikethrough with italic explanation paragraphs. The athlete-sweat
multi-concept problem chains four cancellations (L → mL → g → mol).

Deliberately untouched: 51 qualitative Solutions covering KMT
postulates, IMF identification and ranking, vapor-pressure interpretation,
table look-ups, ice anomaly explanations, and conceptual liquid
properties. None of these have factor-label cancellation to demonstrate.

Build numbers for Ch 10: 9 Solutions rewritten -> 13 LaTeX math chains
in HTML; Canvas Page output regenerated.

Co-Authored-By: Claude Opus 4.7 (1M context) <noreply@anthropic.com>
</commit_message>
<xml_diff>
--- a/Chapter_10_States_of_Matter.docx
+++ b/Chapter_10_States_of_Matter.docx
@@ -6735,32 +6735,47 @@
       <w:r>
         <w:rPr>
           <w:b/>
-          <w:bCs/>
         </w:rPr>
         <w:t xml:space="preserve">Solution: </w:t>
       </w:r>
       <w:r>
-        <w:t xml:space="preserve">q = m × c × ΔT = 100.0 × 4.184 × 50.0 = 20,920 J = 20.9 kJ.</w:t>
-      </w:r>
-    </w:p>
-    <w:p>
-      <w:pPr>
-        <w:pStyle w:val="ListParagraph"/>
-        <w:spacing w:after="80" w:line="300"/>
-        <w:numPr>
-          <w:ilvl w:val="0"/>
-          <w:numId w:val="12"/>
-        </w:numPr>
-      </w:pPr>
-      <w:r>
-        <w:rPr>
-          <w:b/>
-          <w:bCs/>
-        </w:rPr>
-        <w:t xml:space="preserve"/>
-      </w:r>
-      <w:r>
-        <w:t xml:space="preserve">How much heat is released when 50.0 g of aluminum cools from 80.0 °C to 25.0 °C?</w:t>
+        <w:t xml:space="preserve">q = m × c × ΔT = 100.0 </w:t>
+      </w:r>
+      <w:r>
+        <w:rPr>
+          <w:strike w:val="true"/>
+        </w:rPr>
+        <w:t>g</w:t>
+      </w:r>
+      <w:r>
+        <w:t xml:space="preserve"> × (4.184 J / 1 </w:t>
+      </w:r>
+      <w:r>
+        <w:rPr>
+          <w:strike w:val="true"/>
+        </w:rPr>
+        <w:t>g</w:t>
+      </w:r>
+      <w:r>
+        <w:t>·</w:t>
+      </w:r>
+      <w:r>
+        <w:rPr>
+          <w:strike w:val="true"/>
+        </w:rPr>
+        <w:t>°C</w:t>
+      </w:r>
+      <w:r>
+        <w:t xml:space="preserve">) × 50.0 </w:t>
+      </w:r>
+      <w:r>
+        <w:rPr>
+          <w:strike w:val="true"/>
+        </w:rPr>
+        <w:t>°C</w:t>
+      </w:r>
+      <w:r>
+        <w:t xml:space="preserve"> = 20,920 J = 20.9 kJ</w:t>
       </w:r>
     </w:p>
     <w:p>
@@ -6770,13 +6785,9 @@
       </w:pPr>
       <w:r>
         <w:rPr>
-          <w:b/>
-          <w:bCs/>
-        </w:rPr>
-        <w:t xml:space="preserve">Solution: </w:t>
-      </w:r>
-      <w:r>
-        <w:t xml:space="preserve">q = 50.0 × 0.897 × (−55.0) = −2466.8 J = −2.47 kJ (heat released).</w:t>
+          <w:i/>
+        </w:rPr>
+        <w:t>"g" cancels against the mass; "°C" cancels against the temperature change. Three sig figs throughout. Specific heat of water (4.184 J/g·°C) carries the units that make this calculation work.</w:t>
       </w:r>
     </w:p>
     <w:p>
@@ -6796,7 +6807,7 @@
         <w:t xml:space="preserve"/>
       </w:r>
       <w:r>
-        <w:t xml:space="preserve">Compare the temperature rise of 100 g of water vs. 100 g of iron when each absorbs 1000 J.</w:t>
+        <w:t xml:space="preserve">How much heat is released when 50.0 g of aluminum cools from 80.0 °C to 25.0 °C?</w:t>
       </w:r>
     </w:p>
     <w:p>
@@ -6807,32 +6818,11 @@
       <w:r>
         <w:rPr>
           <w:b/>
-          <w:bCs/>
         </w:rPr>
         <w:t xml:space="preserve">Solution: </w:t>
       </w:r>
       <w:r>
-        <w:t xml:space="preserve">Water: ΔT = 1000 / (100 × 4.184) = 2.39 °C. Iron: ΔT = 1000 / (100 × 0.449) = 22.27 °C. Water rises ~10 × less, illustrating water's high specific heat.</w:t>
-      </w:r>
-    </w:p>
-    <w:p>
-      <w:pPr>
-        <w:pStyle w:val="ListParagraph"/>
-        <w:spacing w:after="80" w:line="300"/>
-        <w:numPr>
-          <w:ilvl w:val="0"/>
-          <w:numId w:val="12"/>
-        </w:numPr>
-      </w:pPr>
-      <w:r>
-        <w:rPr>
-          <w:b/>
-          <w:bCs/>
-        </w:rPr>
-        <w:t xml:space="preserve"/>
-      </w:r>
-      <w:r>
-        <w:t xml:space="preserve">Density of ice is 0.917 g/mL; of liquid water at 4 °C is 1.000 g/mL. Volume increase upon freezing 1.00 kg of water?</w:t>
+        <w:t>ΔT = T_f − T_i = 25.0 − 80.0 = −55.0 °C (negative because the metal cools)</w:t>
       </w:r>
     </w:p>
     <w:p>
@@ -6841,34 +6831,43 @@
         <w:ind w:left="360"/>
       </w:pPr>
       <w:r>
-        <w:rPr>
-          <w:b/>
-          <w:bCs/>
-        </w:rPr>
-        <w:t xml:space="preserve">Solution: </w:t>
-      </w:r>
-      <w:r>
-        <w:t xml:space="preserve">Volume of liquid = 1.00 × 1000 / 1.000 = 1000 mL. Volume of ice = 1.00 × 1000 / 0.917 = 1090.5 mL. Increase ≈ 90.5 mL (≈ 9% expansion).</w:t>
-      </w:r>
-    </w:p>
-    <w:p>
-      <w:pPr>
-        <w:pStyle w:val="ListParagraph"/>
-        <w:spacing w:after="80" w:line="300"/>
-        <w:numPr>
-          <w:ilvl w:val="0"/>
-          <w:numId w:val="12"/>
-        </w:numPr>
-      </w:pPr>
-      <w:r>
-        <w:rPr>
-          <w:b/>
-          <w:bCs/>
-        </w:rPr>
-        <w:t xml:space="preserve"/>
-      </w:r>
-      <w:r>
-        <w:t xml:space="preserve">Why do water pipes burst in winter?</w:t>
+        <w:t xml:space="preserve">q = m × c × ΔT = 50.0 </w:t>
+      </w:r>
+      <w:r>
+        <w:rPr>
+          <w:strike w:val="true"/>
+        </w:rPr>
+        <w:t>g</w:t>
+      </w:r>
+      <w:r>
+        <w:t xml:space="preserve"> × (0.897 J / 1 </w:t>
+      </w:r>
+      <w:r>
+        <w:rPr>
+          <w:strike w:val="true"/>
+        </w:rPr>
+        <w:t>g</w:t>
+      </w:r>
+      <w:r>
+        <w:t>·</w:t>
+      </w:r>
+      <w:r>
+        <w:rPr>
+          <w:strike w:val="true"/>
+        </w:rPr>
+        <w:t>°C</w:t>
+      </w:r>
+      <w:r>
+        <w:t xml:space="preserve">) × (−55.0 </w:t>
+      </w:r>
+      <w:r>
+        <w:rPr>
+          <w:strike w:val="true"/>
+        </w:rPr>
+        <w:t>°C</w:t>
+      </w:r>
+      <w:r>
+        <w:t>) = −2466.8 J ≈ −2.47 kJ</w:t>
       </w:r>
     </w:p>
     <w:p>
@@ -6878,934 +6877,9 @@
       </w:pPr>
       <w:r>
         <w:rPr>
-          <w:b/>
-          <w:bCs/>
-        </w:rPr>
-        <w:t xml:space="preserve">Solution: </w:t>
-      </w:r>
-      <w:r>
-        <w:t xml:space="preserve">Water expands when it freezes (~9% increase in volume); the expansion exerts enormous pressure on enclosed pipes, which fail at their weakest point.</w:t>
-      </w:r>
-    </w:p>
-    <w:p>
-      <w:r>
-        <w:br w:type="page"/>
-      </w:r>
-    </w:p>
-    <w:p>
-      <w:pPr>
-        <w:pStyle w:val="Heading2"/>
-      </w:pPr>
-      <w:r>
-        <w:t>Additional Practice Problems by Topic</w:t>
-      </w:r>
-    </w:p>
-    <w:p>
-      <w:pPr>
-        <w:pStyle w:val="Heading3"/>
-      </w:pPr>
-      <w:r>
-        <w:t>KMT and States</w:t>
-      </w:r>
-    </w:p>
-    <w:p>
-      <w:pPr>
-        <w:pStyle w:val="ListParagraph"/>
-        <w:numPr>
-          <w:ilvl w:val="0"/>
-          <w:numId w:val="5"/>
-        </w:numPr>
-      </w:pPr>
-      <w:r>
-        <w:t>State the four central postulates of the kinetic-molecular theory for gases.</w:t>
-      </w:r>
-    </w:p>
-    <w:p>
-      <w:r>
-        <w:rPr>
-          <w:b/>
           <w:i/>
         </w:rPr>
-        <w:t xml:space="preserve">Solution: </w:t>
-      </w:r>
-      <w:r>
-        <w:t>(1) Gases consist of many small particles in random motion. (2) The volume of the particles is negligible compared with the volume of the container. (3) Particles exert no attractive or repulsive forces on each other. (4) Average kinetic energy of the particles is proportional to absolute temperature.</w:t>
-      </w:r>
-    </w:p>
-    <w:p>
-      <w:pPr>
-        <w:pStyle w:val="ListParagraph"/>
-        <w:numPr>
-          <w:ilvl w:val="0"/>
-          <w:numId w:val="5"/>
-        </w:numPr>
-      </w:pPr>
-      <w:r>
-        <w:t>Explain why a gas exerts pressure on the walls of its container.</w:t>
-      </w:r>
-    </w:p>
-    <w:p>
-      <w:r>
-        <w:rPr>
-          <w:b/>
-          <w:i/>
-        </w:rPr>
-        <w:t xml:space="preserve">Solution: </w:t>
-      </w:r>
-      <w:r>
-        <w:t>Gas particles strike the walls; each collision transfers momentum. The total force per unit area from many such collisions per second is the pressure.</w:t>
-      </w:r>
-    </w:p>
-    <w:p>
-      <w:pPr>
-        <w:pStyle w:val="ListParagraph"/>
-        <w:numPr>
-          <w:ilvl w:val="0"/>
-          <w:numId w:val="5"/>
-        </w:numPr>
-      </w:pPr>
-      <w:r>
-        <w:t>If the absolute temperature of a gas doubles, by what factor does the average kinetic energy change?</w:t>
-      </w:r>
-    </w:p>
-    <w:p>
-      <w:r>
-        <w:rPr>
-          <w:b/>
-          <w:i/>
-        </w:rPr>
-        <w:t xml:space="preserve">Solution: </w:t>
-      </w:r>
-      <w:r>
-        <w:t>Doubles. ⟨KE⟩ ∝ T.</w:t>
-      </w:r>
-    </w:p>
-    <w:p>
-      <w:pPr>
-        <w:pStyle w:val="ListParagraph"/>
-        <w:numPr>
-          <w:ilvl w:val="0"/>
-          <w:numId w:val="5"/>
-        </w:numPr>
-      </w:pPr>
-      <w:r>
-        <w:t>Order solid, liquid, and gas by typical particle separation and order/disorder.</w:t>
-      </w:r>
-    </w:p>
-    <w:p>
-      <w:r>
-        <w:rPr>
-          <w:b/>
-          <w:i/>
-        </w:rPr>
-        <w:t xml:space="preserve">Solution: </w:t>
-      </w:r>
-      <w:r>
-        <w:t>Particle separation: solid ≲ liquid ≪ gas. Order: solid (most ordered) &gt; liquid &gt; gas (most disordered).</w:t>
-      </w:r>
-    </w:p>
-    <w:p>
-      <w:pPr>
-        <w:pStyle w:val="ListParagraph"/>
-        <w:numPr>
-          <w:ilvl w:val="0"/>
-          <w:numId w:val="5"/>
-        </w:numPr>
-      </w:pPr>
-      <w:r>
-        <w:t>Why are gases highly compressible and liquids essentially incompressible?</w:t>
-      </w:r>
-    </w:p>
-    <w:p>
-      <w:r>
-        <w:rPr>
-          <w:b/>
-          <w:i/>
-        </w:rPr>
-        <w:t xml:space="preserve">Solution: </w:t>
-      </w:r>
-      <w:r>
-        <w:t>Gas particles are widely separated, so the empty space can be compressed. Liquid particles are already in contact; further compression must overcome strong short-range repulsions.</w:t>
-      </w:r>
-    </w:p>
-    <w:p>
-      <w:pPr>
-        <w:pStyle w:val="Heading3"/>
-      </w:pPr>
-      <w:r>
-        <w:t>Crystal Types</w:t>
-      </w:r>
-    </w:p>
-    <w:p>
-      <w:pPr>
-        <w:pStyle w:val="ListParagraph"/>
-        <w:numPr>
-          <w:ilvl w:val="0"/>
-          <w:numId w:val="6"/>
-        </w:numPr>
-      </w:pPr>
-      <w:r>
-        <w:t>Identify the crystal type of each: NaCl, diamond, Cu, ice, dry ice (CO₂).</w:t>
-      </w:r>
-    </w:p>
-    <w:p>
-      <w:r>
-        <w:rPr>
-          <w:b/>
-          <w:i/>
-        </w:rPr>
-        <w:t xml:space="preserve">Solution: </w:t>
-      </w:r>
-      <w:r>
-        <w:t>NaCl ionic; diamond covalent network; Cu metallic; ice molecular (H-bonded); dry ice molecular.</w:t>
-      </w:r>
-    </w:p>
-    <w:p>
-      <w:pPr>
-        <w:pStyle w:val="ListParagraph"/>
-        <w:numPr>
-          <w:ilvl w:val="0"/>
-          <w:numId w:val="6"/>
-        </w:numPr>
-      </w:pPr>
-      <w:r>
-        <w:t>Predict the relative melting points of an ionic crystal and a molecular crystal of similar molar mass.</w:t>
-      </w:r>
-    </w:p>
-    <w:p>
-      <w:r>
-        <w:rPr>
-          <w:b/>
-          <w:i/>
-        </w:rPr>
-        <w:t xml:space="preserve">Solution: </w:t>
-      </w:r>
-      <w:r>
-        <w:t>The ionic crystal melts much higher because Coulombic attractions among ions are far stronger than intermolecular forces in molecular solids.</w:t>
-      </w:r>
-    </w:p>
-    <w:p>
-      <w:pPr>
-        <w:pStyle w:val="ListParagraph"/>
-        <w:numPr>
-          <w:ilvl w:val="0"/>
-          <w:numId w:val="6"/>
-        </w:numPr>
-      </w:pPr>
-      <w:r>
-        <w:t>Why are metals typically good electrical conductors in the solid state, while ionic crystals are not?</w:t>
-      </w:r>
-    </w:p>
-    <w:p>
-      <w:r>
-        <w:rPr>
-          <w:b/>
-          <w:i/>
-        </w:rPr>
-        <w:t xml:space="preserve">Solution: </w:t>
-      </w:r>
-      <w:r>
-        <w:t>Metals have a delocalized “sea” of valence electrons free to move; ionic solids have ions locked in lattice positions, so charges cannot flow. Molten ionic compounds, however, do conduct.</w:t>
-      </w:r>
-    </w:p>
-    <w:p>
-      <w:pPr>
-        <w:pStyle w:val="ListParagraph"/>
-        <w:numPr>
-          <w:ilvl w:val="0"/>
-          <w:numId w:val="6"/>
-        </w:numPr>
-      </w:pPr>
-      <w:r>
-        <w:t>Explain why diamond is one of the hardest known substances.</w:t>
-      </w:r>
-    </w:p>
-    <w:p>
-      <w:r>
-        <w:rPr>
-          <w:b/>
-          <w:i/>
-        </w:rPr>
-        <w:t xml:space="preserve">Solution: </w:t>
-      </w:r>
-      <w:r>
-        <w:t>Each carbon atom is bonded covalently to four neighbors in a 3D network. Deforming the crystal requires breaking strong directional covalent bonds throughout the structure.</w:t>
-      </w:r>
-    </w:p>
-    <w:p>
-      <w:pPr>
-        <w:pStyle w:val="ListParagraph"/>
-        <w:numPr>
-          <w:ilvl w:val="0"/>
-          <w:numId w:val="6"/>
-        </w:numPr>
-      </w:pPr>
-      <w:r>
-        <w:t>A solid is brittle, has a high melting point, dissolves in water, and the solution conducts electricity. Identify the crystal type.</w:t>
-      </w:r>
-    </w:p>
-    <w:p>
-      <w:r>
-        <w:rPr>
-          <w:b/>
-          <w:i/>
-        </w:rPr>
-        <w:t xml:space="preserve">Solution: </w:t>
-      </w:r>
-      <w:r>
-        <w:t>Ionic. Brittleness, high m.p., water-solubility, and ionic conductivity in solution are signature properties.</w:t>
-      </w:r>
-    </w:p>
-    <w:p>
-      <w:pPr>
-        <w:pStyle w:val="Heading3"/>
-      </w:pPr>
-      <w:r>
-        <w:t>Liquid Properties</w:t>
-      </w:r>
-    </w:p>
-    <w:p>
-      <w:pPr>
-        <w:pStyle w:val="ListParagraph"/>
-        <w:numPr>
-          <w:ilvl w:val="0"/>
-          <w:numId w:val="7"/>
-        </w:numPr>
-      </w:pPr>
-      <w:r>
-        <w:t>Define surface tension and give an everyday example.</w:t>
-      </w:r>
-    </w:p>
-    <w:p>
-      <w:r>
-        <w:rPr>
-          <w:b/>
-          <w:i/>
-        </w:rPr>
-        <w:t xml:space="preserve">Solution: </w:t>
-      </w:r>
-      <w:r>
-        <w:t>Surface tension is the energy required to increase the surface area of a liquid (the inward pull on surface molecules). Example: water beads on a waxed surface; insects walk on water.</w:t>
-      </w:r>
-    </w:p>
-    <w:p>
-      <w:pPr>
-        <w:pStyle w:val="ListParagraph"/>
-        <w:numPr>
-          <w:ilvl w:val="0"/>
-          <w:numId w:val="7"/>
-        </w:numPr>
-      </w:pPr>
-      <w:r>
-        <w:t>Compare the viscosity of water and honey, and link the difference to intermolecular forces.</w:t>
-      </w:r>
-    </w:p>
-    <w:p>
-      <w:r>
-        <w:rPr>
-          <w:b/>
-          <w:i/>
-        </w:rPr>
-        <w:t xml:space="preserve">Solution: </w:t>
-      </w:r>
-      <w:r>
-        <w:t>Honey is much more viscous. Honey contains sugars that form many hydrogen bonds among large molecules, increasing internal resistance to flow.</w:t>
-      </w:r>
-    </w:p>
-    <w:p>
-      <w:pPr>
-        <w:pStyle w:val="ListParagraph"/>
-        <w:numPr>
-          <w:ilvl w:val="0"/>
-          <w:numId w:val="7"/>
-        </w:numPr>
-      </w:pPr>
-      <w:r>
-        <w:t>Explain capillary action in a thin glass tube of water.</w:t>
-      </w:r>
-    </w:p>
-    <w:p>
-      <w:r>
-        <w:rPr>
-          <w:b/>
-          <w:i/>
-        </w:rPr>
-        <w:t xml:space="preserve">Solution: </w:t>
-      </w:r>
-      <w:r>
-        <w:t>Adhesive forces between water and glass exceed cohesive forces among water molecules. Water climbs the tube against gravity until adhesion balances the weight of the column.</w:t>
-      </w:r>
-    </w:p>
-    <w:p>
-      <w:pPr>
-        <w:pStyle w:val="ListParagraph"/>
-        <w:numPr>
-          <w:ilvl w:val="0"/>
-          <w:numId w:val="7"/>
-        </w:numPr>
-      </w:pPr>
-      <w:r>
-        <w:t>Why does water have a higher boiling point than methane (CH₄), although both have similar molar mass?</w:t>
-      </w:r>
-    </w:p>
-    <w:p>
-      <w:r>
-        <w:rPr>
-          <w:b/>
-          <w:i/>
-        </w:rPr>
-        <w:t xml:space="preserve">Solution: </w:t>
-      </w:r>
-      <w:r>
-        <w:t>Water hydrogen-bonds; methane has only weak London dispersion forces. Stronger intermolecular forces in water raise its boiling point dramatically.</w:t>
-      </w:r>
-    </w:p>
-    <w:p>
-      <w:pPr>
-        <w:pStyle w:val="ListParagraph"/>
-        <w:numPr>
-          <w:ilvl w:val="0"/>
-          <w:numId w:val="7"/>
-        </w:numPr>
-      </w:pPr>
-      <w:r>
-        <w:t>Define vapor pressure of a liquid.</w:t>
-      </w:r>
-    </w:p>
-    <w:p>
-      <w:r>
-        <w:rPr>
-          <w:b/>
-          <w:i/>
-        </w:rPr>
-        <w:t xml:space="preserve">Solution: </w:t>
-      </w:r>
-      <w:r>
-        <w:t>The pressure exerted by the vapor in equilibrium with its liquid at a given temperature. It increases with temperature and depends on the strength of intermolecular forces.</w:t>
-      </w:r>
-    </w:p>
-    <w:p>
-      <w:pPr>
-        <w:pStyle w:val="Heading3"/>
-      </w:pPr>
-      <w:r>
-        <w:t>Intermolecular Forces</w:t>
-      </w:r>
-    </w:p>
-    <w:p>
-      <w:pPr>
-        <w:pStyle w:val="ListParagraph"/>
-        <w:numPr>
-          <w:ilvl w:val="0"/>
-          <w:numId w:val="8"/>
-        </w:numPr>
-      </w:pPr>
-      <w:r>
-        <w:t>Identify the dominant IMF in: CH₄, HF, CH₃OH, NaCl, Ne.</w:t>
-      </w:r>
-    </w:p>
-    <w:p>
-      <w:r>
-        <w:rPr>
-          <w:b/>
-          <w:i/>
-        </w:rPr>
-        <w:t xml:space="preserve">Solution: </w:t>
-      </w:r>
-      <w:r>
-        <w:t>CH₄ dispersion; HF hydrogen bonding (and dipole–dipole, dispersion); CH₃OH hydrogen bonding; NaCl ionic forces (not strictly an IMF — a solid lattice); Ne dispersion.</w:t>
-      </w:r>
-    </w:p>
-    <w:p>
-      <w:pPr>
-        <w:pStyle w:val="ListParagraph"/>
-        <w:numPr>
-          <w:ilvl w:val="0"/>
-          <w:numId w:val="8"/>
-        </w:numPr>
-      </w:pPr>
-      <w:r>
-        <w:t>Rank in order of increasing boiling point: CH₄, CH₃OH, H₂O.</w:t>
-      </w:r>
-    </w:p>
-    <w:p>
-      <w:r>
-        <w:rPr>
-          <w:b/>
-          <w:i/>
-        </w:rPr>
-        <w:t xml:space="preserve">Solution: </w:t>
-      </w:r>
-      <w:r>
-        <w:t>CH₄ (−161 °C) &lt; CH₃OH (65 °C) &lt; H₂O (100 °C). Water hydrogen-bonds with two donors and two acceptors per molecule, beating methanol.</w:t>
-      </w:r>
-    </w:p>
-    <w:p>
-      <w:pPr>
-        <w:pStyle w:val="ListParagraph"/>
-        <w:numPr>
-          <w:ilvl w:val="0"/>
-          <w:numId w:val="8"/>
-        </w:numPr>
-      </w:pPr>
-      <w:r>
-        <w:t>Explain why noble gas boiling points increase from He to Xe.</w:t>
-      </w:r>
-    </w:p>
-    <w:p>
-      <w:r>
-        <w:rPr>
-          <w:b/>
-          <w:i/>
-        </w:rPr>
-        <w:t xml:space="preserve">Solution: </w:t>
-      </w:r>
-      <w:r>
-        <w:t>Larger atoms have more electrons and more polarizable clouds, so London dispersion forces grow stronger down the group, raising boiling points.</w:t>
-      </w:r>
-    </w:p>
-    <w:p>
-      <w:pPr>
-        <w:pStyle w:val="ListParagraph"/>
-        <w:numPr>
-          <w:ilvl w:val="0"/>
-          <w:numId w:val="8"/>
-        </w:numPr>
-      </w:pPr>
-      <w:r>
-        <w:t>Which has a higher boiling point: HBr or HCl? Explain.</w:t>
-      </w:r>
-    </w:p>
-    <w:p>
-      <w:r>
-        <w:rPr>
-          <w:b/>
-          <w:i/>
-        </w:rPr>
-        <w:t xml:space="preserve">Solution: </w:t>
-      </w:r>
-      <w:r>
-        <w:t>HBr. Both are dipole–dipole, but HBr has more electrons and larger dispersion forces, dominating the slightly larger H—X dipole of HCl.</w:t>
-      </w:r>
-    </w:p>
-    <w:p>
-      <w:pPr>
-        <w:pStyle w:val="ListParagraph"/>
-        <w:numPr>
-          <w:ilvl w:val="0"/>
-          <w:numId w:val="8"/>
-        </w:numPr>
-      </w:pPr>
-      <w:r>
-        <w:t>Why is CHCl₃ a higher-boiling liquid than CH₄ of similar molar mass family?</w:t>
-      </w:r>
-    </w:p>
-    <w:p>
-      <w:r>
-        <w:rPr>
-          <w:b/>
-          <w:i/>
-        </w:rPr>
-        <w:t xml:space="preserve">Solution: </w:t>
-      </w:r>
-      <w:r>
-        <w:t>CHCl₃ has a permanent dipole (polar) and large dispersion forces from many electrons. CH₄ is nonpolar with much smaller dispersion forces.</w:t>
-      </w:r>
-    </w:p>
-    <w:p>
-      <w:pPr>
-        <w:pStyle w:val="Heading3"/>
-      </w:pPr>
-      <w:r>
-        <w:t>Vapor Pressure and Boiling</w:t>
-      </w:r>
-    </w:p>
-    <w:p>
-      <w:pPr>
-        <w:pStyle w:val="ListParagraph"/>
-        <w:numPr>
-          <w:ilvl w:val="0"/>
-          <w:numId w:val="9"/>
-        </w:numPr>
-      </w:pPr>
-      <w:r>
-        <w:t>Define the boiling point of a liquid in terms of vapor pressure.</w:t>
-      </w:r>
-    </w:p>
-    <w:p>
-      <w:r>
-        <w:rPr>
-          <w:b/>
-          <w:i/>
-        </w:rPr>
-        <w:t xml:space="preserve">Solution: </w:t>
-      </w:r>
-      <w:r>
-        <w:t>The temperature at which the liquid’s vapor pressure equals the external (atmospheric) pressure.</w:t>
-      </w:r>
-    </w:p>
-    <w:p>
-      <w:pPr>
-        <w:pStyle w:val="ListParagraph"/>
-        <w:numPr>
-          <w:ilvl w:val="0"/>
-          <w:numId w:val="9"/>
-        </w:numPr>
-      </w:pPr>
-      <w:r>
-        <w:t>Why does water boil at a lower temperature on a high mountain?</w:t>
-      </w:r>
-    </w:p>
-    <w:p>
-      <w:r>
-        <w:rPr>
-          <w:b/>
-          <w:i/>
-        </w:rPr>
-        <w:t xml:space="preserve">Solution: </w:t>
-      </w:r>
-      <w:r>
-        <w:t>Atmospheric pressure is lower at altitude, so the vapor pressure required to match it is reached at a lower temperature.</w:t>
-      </w:r>
-    </w:p>
-    <w:p>
-      <w:pPr>
-        <w:pStyle w:val="ListParagraph"/>
-        <w:numPr>
-          <w:ilvl w:val="0"/>
-          <w:numId w:val="9"/>
-        </w:numPr>
-      </w:pPr>
-      <w:r>
-        <w:t>Predict whether ethanol or water has the higher vapor pressure at 25 °C, given that ethanol’s boiling point (78 °C) is below water’s (100 °C).</w:t>
-      </w:r>
-    </w:p>
-    <w:p>
-      <w:r>
-        <w:rPr>
-          <w:b/>
-          <w:i/>
-        </w:rPr>
-        <w:t xml:space="preserve">Solution: </w:t>
-      </w:r>
-      <w:r>
-        <w:t>Ethanol. Lower boiling point means higher vapor pressure at any given temperature — ethanol’s intermolecular forces are weaker than water’s.</w:t>
-      </w:r>
-    </w:p>
-    <w:p>
-      <w:pPr>
-        <w:pStyle w:val="ListParagraph"/>
-        <w:numPr>
-          <w:ilvl w:val="0"/>
-          <w:numId w:val="9"/>
-        </w:numPr>
-      </w:pPr>
-      <w:r>
-        <w:t>Explain why a pressure cooker speeds up cooking.</w:t>
-      </w:r>
-    </w:p>
-    <w:p>
-      <w:r>
-        <w:rPr>
-          <w:b/>
-          <w:i/>
-        </w:rPr>
-        <w:t xml:space="preserve">Solution: </w:t>
-      </w:r>
-      <w:r>
-        <w:t>Sealed pressure rises; water boils at a higher temperature (e.g., ≈120 °C at 2 atm). Hotter water cooks foods faster.</w:t>
-      </w:r>
-    </w:p>
-    <w:p>
-      <w:pPr>
-        <w:pStyle w:val="ListParagraph"/>
-        <w:numPr>
-          <w:ilvl w:val="0"/>
-          <w:numId w:val="9"/>
-        </w:numPr>
-      </w:pPr>
-      <w:r>
-        <w:t>If a liquid’s vapor pressure at 50 °C is 250 mmHg, will it boil at 50 °C and standard atmospheric pressure (760 mmHg)? Explain.</w:t>
-      </w:r>
-    </w:p>
-    <w:p>
-      <w:r>
-        <w:rPr>
-          <w:b/>
-          <w:i/>
-        </w:rPr>
-        <w:t xml:space="preserve">Solution: </w:t>
-      </w:r>
-      <w:r>
-        <w:t>No. Boiling occurs only when vapor pressure equals atmospheric pressure (760 mmHg). At 50 °C the vapor pressure is far below that, so it only evaporates.</w:t>
-      </w:r>
-    </w:p>
-    <w:p>
-      <w:pPr>
-        <w:pStyle w:val="Heading3"/>
-      </w:pPr>
-      <w:r>
-        <w:t>Specific Heat</w:t>
-      </w:r>
-    </w:p>
-    <w:p>
-      <w:pPr>
-        <w:pStyle w:val="ListParagraph"/>
-        <w:numPr>
-          <w:ilvl w:val="0"/>
-          <w:numId w:val="10"/>
-        </w:numPr>
-      </w:pPr>
-      <w:r>
-        <w:t>How much heat is required to raise 100.0 g of water from 25.0 °C to 75.0 °C? (c = 4.184 J/g·°C.)</w:t>
-      </w:r>
-    </w:p>
-    <w:p>
-      <w:r>
-        <w:rPr>
-          <w:b/>
-          <w:i/>
-        </w:rPr>
-        <w:t xml:space="preserve">Solution: </w:t>
-      </w:r>
-      <w:r>
-        <w:t>q = mcΔT = 100.0 × 4.184 × 50.0 = 20920 J = 20.9 kJ.</w:t>
-      </w:r>
-    </w:p>
-    <w:p>
-      <w:pPr>
-        <w:pStyle w:val="ListParagraph"/>
-        <w:numPr>
-          <w:ilvl w:val="0"/>
-          <w:numId w:val="10"/>
-        </w:numPr>
-      </w:pPr>
-      <w:r>
-        <w:t>A 50.0 g block of metal absorbs 1.20 kJ as it heats from 20.0 to 84.0 °C. Compute c.</w:t>
-      </w:r>
-    </w:p>
-    <w:p>
-      <w:r>
-        <w:rPr>
-          <w:b/>
-          <w:i/>
-        </w:rPr>
-        <w:t xml:space="preserve">Solution: </w:t>
-      </w:r>
-      <w:r>
-        <w:t>c = q/(mΔT) = 1200 J / (50.0 × 64.0 °C) = 0.375 J/g·°C.</w:t>
-      </w:r>
-    </w:p>
-    <w:p>
-      <w:pPr>
-        <w:pStyle w:val="ListParagraph"/>
-        <w:numPr>
-          <w:ilvl w:val="0"/>
-          <w:numId w:val="10"/>
-        </w:numPr>
-      </w:pPr>
-      <w:r>
-        <w:t>Why does water make a good coolant?</w:t>
-      </w:r>
-    </w:p>
-    <w:p>
-      <w:r>
-        <w:rPr>
-          <w:b/>
-          <w:i/>
-        </w:rPr>
-        <w:t xml:space="preserve">Solution: </w:t>
-      </w:r>
-      <w:r>
-        <w:t>Water has an unusually high specific heat (4.184 J/g·°C) and high heat of vaporization, so it absorbs a great deal of heat per gram for modest temperature change.</w:t>
-      </w:r>
-    </w:p>
-    <w:p>
-      <w:pPr>
-        <w:pStyle w:val="ListParagraph"/>
-        <w:numPr>
-          <w:ilvl w:val="0"/>
-          <w:numId w:val="10"/>
-        </w:numPr>
-      </w:pPr>
-      <w:r>
-        <w:t>How many joules to raise the temperature of 250 g of aluminum (c = 0.897 J/g·°C) by 30.0 °C?</w:t>
-      </w:r>
-    </w:p>
-    <w:p>
-      <w:r>
-        <w:rPr>
-          <w:b/>
-          <w:i/>
-        </w:rPr>
-        <w:t xml:space="preserve">Solution: </w:t>
-      </w:r>
-      <w:r>
-        <w:t>q = 250 × 0.897 × 30.0 = 6728 J ≈ 6.73 kJ.</w:t>
-      </w:r>
-    </w:p>
-    <w:p>
-      <w:pPr>
-        <w:pStyle w:val="ListParagraph"/>
-        <w:numPr>
-          <w:ilvl w:val="0"/>
-          <w:numId w:val="10"/>
-        </w:numPr>
-      </w:pPr>
-      <w:r>
-        <w:t>If 500.0 J is added to 25.0 g of copper (c = 0.385 J/g·°C) at 22.0 °C, what is the final T?</w:t>
-      </w:r>
-    </w:p>
-    <w:p>
-      <w:r>
-        <w:rPr>
-          <w:b/>
-          <w:i/>
-        </w:rPr>
-        <w:t xml:space="preserve">Solution: </w:t>
-      </w:r>
-      <w:r>
-        <w:t>ΔT = q/(mc) = 500/(25.0 × 0.385) = 51.95 °C; T_f = 22.0 + 51.95 = 73.95 °C ≈ 74.0 °C.</w:t>
-      </w:r>
-    </w:p>
-    <w:p>
-      <w:pPr>
-        <w:pStyle w:val="Heading3"/>
-      </w:pPr>
-      <w:r>
-        <w:t>Anomalies of Water</w:t>
-      </w:r>
-    </w:p>
-    <w:p>
-      <w:pPr>
-        <w:pStyle w:val="ListParagraph"/>
-        <w:numPr>
-          <w:ilvl w:val="0"/>
-          <w:numId w:val="11"/>
-        </w:numPr>
-      </w:pPr>
-      <w:r>
-        <w:t>State two ways in which water’s solid form (ice) is anomalous compared with most substances.</w:t>
-      </w:r>
-    </w:p>
-    <w:p>
-      <w:r>
-        <w:rPr>
-          <w:b/>
-          <w:i/>
-        </w:rPr>
-        <w:t xml:space="preserve">Solution: </w:t>
-      </w:r>
-      <w:r>
-        <w:t>(1) Ice is less dense than liquid water, so it floats. (2) Most solids are denser than their liquid forms; ice’s open hydrogen-bonded lattice is the exception.</w:t>
-      </w:r>
-    </w:p>
-    <w:p>
-      <w:pPr>
-        <w:pStyle w:val="ListParagraph"/>
-        <w:numPr>
-          <w:ilvl w:val="0"/>
-          <w:numId w:val="11"/>
-        </w:numPr>
-      </w:pPr>
-      <w:r>
-        <w:t>Why is the density anomaly of water important for aquatic life?</w:t>
-      </w:r>
-    </w:p>
-    <w:p>
-      <w:r>
-        <w:rPr>
-          <w:b/>
-          <w:i/>
-        </w:rPr>
-        <w:t xml:space="preserve">Solution: </w:t>
-      </w:r>
-      <w:r>
-        <w:t>Ice forms a floating insulating layer. Liquid water at 4 °C (its maximum density) sinks below the ice, allowing aquatic organisms to survive winter at the bottom.</w:t>
-      </w:r>
-    </w:p>
-    <w:p>
-      <w:pPr>
-        <w:pStyle w:val="ListParagraph"/>
-        <w:numPr>
-          <w:ilvl w:val="0"/>
-          <w:numId w:val="11"/>
-        </w:numPr>
-      </w:pPr>
-      <w:r>
-        <w:t>Why does water have such a high boiling point compared with H₂S, H₂Se, and H₂Te?</w:t>
-      </w:r>
-    </w:p>
-    <w:p>
-      <w:r>
-        <w:rPr>
-          <w:b/>
-          <w:i/>
-        </w:rPr>
-        <w:t xml:space="preserve">Solution: </w:t>
-      </w:r>
-      <w:r>
-        <w:t>Hydrogen bonding. The strong O—H ··· O network in water requires much more energy to disrupt than the dipole–dipole + dispersion forces in heavier-chalcogen hydrides.</w:t>
-      </w:r>
-    </w:p>
-    <w:p>
-      <w:pPr>
-        <w:pStyle w:val="ListParagraph"/>
-        <w:numPr>
-          <w:ilvl w:val="0"/>
-          <w:numId w:val="11"/>
-        </w:numPr>
-      </w:pPr>
-      <w:r>
-        <w:t>Explain why water has unusually high specific heat compared with most liquids.</w:t>
-      </w:r>
-    </w:p>
-    <w:p>
-      <w:r>
-        <w:rPr>
-          <w:b/>
-          <w:i/>
-        </w:rPr>
-        <w:t xml:space="preserve">Solution: </w:t>
-      </w:r>
-      <w:r>
-        <w:t>A large fraction of input energy goes into stretching/breaking hydrogen bonds and increasing molecular motion within the H-bonded network, not just translational kinetic energy.</w:t>
-      </w:r>
-    </w:p>
-    <w:p>
-      <w:pPr>
-        <w:pStyle w:val="ListParagraph"/>
-        <w:numPr>
-          <w:ilvl w:val="0"/>
-          <w:numId w:val="11"/>
-        </w:numPr>
-      </w:pPr>
-      <w:r>
-        <w:t>Why is hot water poured on ice an effective de-icer in some situations but not in very cold weather?</w:t>
-      </w:r>
-    </w:p>
-    <w:p>
-      <w:r>
-        <w:rPr>
-          <w:b/>
-          <w:i/>
-        </w:rPr>
-        <w:t xml:space="preserve">Solution: </w:t>
-      </w:r>
-      <w:r>
-        <w:t>Hot water transfers heat to melt ice quickly. In very cold weather (well below 0 °C), the meltwater quickly refreezes, often producing a more dangerous slick of fresh ice.</w:t>
-      </w:r>
-    </w:p>
-    <w:p>
-      <w:pPr>
-        <w:pStyle w:val="Heading2"/>
-      </w:pPr>
-      <w:r>
-        <w:rPr>
-          <w:b/>
-          <w:bCs/>
-        </w:rPr>
-        <w:t xml:space="preserve">Multi-Concept Problems</w:t>
+        <w:t>"g" / "°C" cancel as in the standard q = mcΔT chain. Negative q means heat is released by the aluminum.</w:t>
       </w:r>
     </w:p>
     <w:p>
@@ -7814,7 +6888,7 @@
         <w:spacing w:after="80" w:line="300"/>
         <w:numPr>
           <w:ilvl w:val="0"/>
-          <w:numId w:val="13"/>
+          <w:numId w:val="12"/>
         </w:numPr>
       </w:pPr>
       <w:r>
@@ -7825,31 +6899,7 @@
         <w:t xml:space="preserve"/>
       </w:r>
       <w:r>
-        <w:t xml:space="preserve">An athlete sweats out 0.500 L of water during a workout. </w:t>
-      </w:r>
-    </w:p>
-    <w:p>
-      <w:pPr>
-        <w:pStyle w:val="ListParagraph"/>
-        <w:numPr>
-          <w:ilvl w:val="0"/>
-          <w:numId w:val="22"/>
-        </w:numPr>
-      </w:pPr>
-      <w:r>
-        <w:t xml:space="preserve">Mass of water? </w:t>
-      </w:r>
-    </w:p>
-    <w:p>
-      <w:pPr>
-        <w:pStyle w:val="ListParagraph"/>
-        <w:numPr>
-          <w:ilvl w:val="0"/>
-          <w:numId w:val="22"/>
-        </w:numPr>
-      </w:pPr>
-      <w:r>
-        <w:t xml:space="preserve">If all of it evaporates from the skin (Δ_vap H = 40.7 kJ/mol at 100 °C; about 44 kJ/mol at body temperature), how much heat is removed from the body?</w:t>
+        <w:t xml:space="preserve">Compare the temperature rise of 100 g of water vs. 100 g of iron when each absorbs 1000 J.</w:t>
       </w:r>
     </w:p>
     <w:p>
@@ -7860,24 +6910,1546 @@
       <w:r>
         <w:rPr>
           <w:b/>
-          <w:bCs/>
         </w:rPr>
         <w:t xml:space="preserve">Solution: </w:t>
       </w:r>
       <w:r>
+        <w:t xml:space="preserve">Water: ΔT = q / (m × c) = 1000 </w:t>
+      </w:r>
+      <w:r>
+        <w:rPr>
+          <w:strike w:val="true"/>
+        </w:rPr>
+        <w:t>J</w:t>
+      </w:r>
+      <w:r>
+        <w:t xml:space="preserve"> / (100 </w:t>
+      </w:r>
+      <w:r>
+        <w:rPr>
+          <w:strike w:val="true"/>
+        </w:rPr>
+        <w:t>g</w:t>
+      </w:r>
+      <w:r>
+        <w:t xml:space="preserve"> × (4.184 </w:t>
+      </w:r>
+      <w:r>
+        <w:rPr>
+          <w:strike w:val="true"/>
+        </w:rPr>
+        <w:t>J</w:t>
+      </w:r>
+      <w:r>
+        <w:t xml:space="preserve"> / 1 </w:t>
+      </w:r>
+      <w:r>
+        <w:rPr>
+          <w:strike w:val="true"/>
+        </w:rPr>
+        <w:t>g</w:t>
+      </w:r>
+      <w:r>
+        <w:t>·°C)) = 1000 / 418.4 = 2.39 °C</w:t>
+      </w:r>
+    </w:p>
+    <w:p>
+      <w:pPr>
+        <w:spacing w:after="160" w:line="300"/>
+        <w:ind w:left="360"/>
+      </w:pPr>
+      <w:r>
+        <w:t xml:space="preserve">Iron:  ΔT = q / (m × c) = 1000 </w:t>
+      </w:r>
+      <w:r>
+        <w:rPr>
+          <w:strike w:val="true"/>
+        </w:rPr>
+        <w:t>J</w:t>
+      </w:r>
+      <w:r>
+        <w:t xml:space="preserve"> / (100 </w:t>
+      </w:r>
+      <w:r>
+        <w:rPr>
+          <w:strike w:val="true"/>
+        </w:rPr>
+        <w:t>g</w:t>
+      </w:r>
+      <w:r>
+        <w:t xml:space="preserve"> × (0.449 </w:t>
+      </w:r>
+      <w:r>
+        <w:rPr>
+          <w:strike w:val="true"/>
+        </w:rPr>
+        <w:t>J</w:t>
+      </w:r>
+      <w:r>
+        <w:t xml:space="preserve"> / 1 </w:t>
+      </w:r>
+      <w:r>
+        <w:rPr>
+          <w:strike w:val="true"/>
+        </w:rPr>
+        <w:t>g</w:t>
+      </w:r>
+      <w:r>
+        <w:t>·°C)) = 1000 / 44.9 = 22.27 °C</w:t>
+      </w:r>
+    </w:p>
+    <w:p>
+      <w:pPr>
+        <w:spacing w:after="160" w:line="300"/>
+        <w:ind w:left="360"/>
+      </w:pPr>
+      <w:r>
+        <w:rPr>
+          <w:i/>
+        </w:rPr>
+        <w:t>"J" and "g" cancel in each calculation, leaving the temperature rise in °C. Water's higher specific heat (4.184 vs 0.449 J/g·°C) means the same 1000 J raises water's temperature ~10× less than iron's — the basis of water as a thermal buffer.</w:t>
+      </w:r>
+    </w:p>
+    <w:p>
+      <w:pPr>
+        <w:pStyle w:val="ListParagraph"/>
+        <w:spacing w:after="80" w:line="300"/>
+        <w:numPr>
+          <w:ilvl w:val="0"/>
+          <w:numId w:val="12"/>
+        </w:numPr>
+      </w:pPr>
+      <w:r>
+        <w:rPr>
+          <w:b/>
+          <w:bCs/>
+        </w:rPr>
         <w:t xml:space="preserve"/>
       </w:r>
-    </w:p>
-    <w:p>
-      <w:pPr>
-        <w:pStyle w:val="ListParagraph"/>
-        <w:numPr>
-          <w:ilvl w:val="0"/>
-          <w:numId w:val="23"/>
-        </w:numPr>
-      </w:pPr>
-      <w:r>
-        <w:t xml:space="preserve">Mass = 0.500 × 1000 × 1.00 g/mL = 500. g. </w:t>
+      <w:r>
+        <w:t xml:space="preserve">Density of ice is 0.917 g/mL; of liquid water at 4 °C is 1.000 g/mL. Volume increase upon freezing 1.00 kg of water?</w:t>
+      </w:r>
+    </w:p>
+    <w:p>
+      <w:pPr>
+        <w:spacing w:after="160" w:line="300"/>
+        <w:ind w:left="360"/>
+      </w:pPr>
+      <w:r>
+        <w:rPr>
+          <w:b/>
+        </w:rPr>
+        <w:t xml:space="preserve">Solution: </w:t>
+      </w:r>
+      <w:r>
+        <w:t xml:space="preserve">Volume of liquid water = 1.00 </w:t>
+      </w:r>
+      <w:r>
+        <w:rPr>
+          <w:strike w:val="true"/>
+        </w:rPr>
+        <w:t>kg</w:t>
+      </w:r>
+      <w:r>
+        <w:t xml:space="preserve"> × (1000 </w:t>
+      </w:r>
+      <w:r>
+        <w:rPr>
+          <w:strike w:val="true"/>
+        </w:rPr>
+        <w:t>g</w:t>
+      </w:r>
+      <w:r>
+        <w:t xml:space="preserve"> / 1 </w:t>
+      </w:r>
+      <w:r>
+        <w:rPr>
+          <w:strike w:val="true"/>
+        </w:rPr>
+        <w:t>kg</w:t>
+      </w:r>
+      <w:r>
+        <w:t xml:space="preserve">) × (1 mL / 1.000 </w:t>
+      </w:r>
+      <w:r>
+        <w:rPr>
+          <w:strike w:val="true"/>
+        </w:rPr>
+        <w:t>g</w:t>
+      </w:r>
+      <w:r>
+        <w:t>) = 1000 mL</w:t>
+      </w:r>
+    </w:p>
+    <w:p>
+      <w:pPr>
+        <w:spacing w:after="160" w:line="300"/>
+        <w:ind w:left="360"/>
+      </w:pPr>
+      <w:r>
+        <w:t xml:space="preserve">Volume of ice = 1.00 </w:t>
+      </w:r>
+      <w:r>
+        <w:rPr>
+          <w:strike w:val="true"/>
+        </w:rPr>
+        <w:t>kg</w:t>
+      </w:r>
+      <w:r>
+        <w:t xml:space="preserve"> × (1000 </w:t>
+      </w:r>
+      <w:r>
+        <w:rPr>
+          <w:strike w:val="true"/>
+        </w:rPr>
+        <w:t>g</w:t>
+      </w:r>
+      <w:r>
+        <w:t xml:space="preserve"> / 1 </w:t>
+      </w:r>
+      <w:r>
+        <w:rPr>
+          <w:strike w:val="true"/>
+        </w:rPr>
+        <w:t>kg</w:t>
+      </w:r>
+      <w:r>
+        <w:t xml:space="preserve">) × (1 mL / 0.917 </w:t>
+      </w:r>
+      <w:r>
+        <w:rPr>
+          <w:strike w:val="true"/>
+        </w:rPr>
+        <w:t>g</w:t>
+      </w:r>
+      <w:r>
+        <w:t>) = 1090.5 mL</w:t>
+      </w:r>
+    </w:p>
+    <w:p>
+      <w:pPr>
+        <w:spacing w:after="160" w:line="300"/>
+        <w:ind w:left="360"/>
+      </w:pPr>
+      <w:r>
+        <w:t>Increase = 1090.5 − 1000 = 90.5 mL (≈ 9.0% expansion)</w:t>
+      </w:r>
+    </w:p>
+    <w:p>
+      <w:pPr>
+        <w:spacing w:after="160" w:line="300"/>
+        <w:ind w:left="360"/>
+      </w:pPr>
+      <w:r>
+        <w:rPr>
+          <w:i/>
+        </w:rPr>
+        <w:t>"kg" and "g" cancel through the unit chain in each volume calculation. The ice has more empty space because hydrogen bonding locks water molecules into an open tetrahedral lattice.</w:t>
+      </w:r>
+    </w:p>
+    <w:p>
+      <w:pPr>
+        <w:pStyle w:val="ListParagraph"/>
+        <w:spacing w:after="80" w:line="300"/>
+        <w:numPr>
+          <w:ilvl w:val="0"/>
+          <w:numId w:val="12"/>
+        </w:numPr>
+      </w:pPr>
+      <w:r>
+        <w:rPr>
+          <w:b/>
+          <w:bCs/>
+        </w:rPr>
+        <w:t xml:space="preserve"/>
+      </w:r>
+      <w:r>
+        <w:t xml:space="preserve">Why do water pipes burst in winter?</w:t>
+      </w:r>
+    </w:p>
+    <w:p>
+      <w:pPr>
+        <w:spacing w:after="160" w:line="300"/>
+        <w:ind w:left="360"/>
+      </w:pPr>
+      <w:r>
+        <w:rPr>
+          <w:b/>
+          <w:bCs/>
+        </w:rPr>
+        <w:t xml:space="preserve">Solution: </w:t>
+      </w:r>
+      <w:r>
+        <w:t xml:space="preserve">Water expands when it freezes (~9% increase in volume); the expansion exerts enormous pressure on enclosed pipes, which fail at their weakest point.</w:t>
+      </w:r>
+    </w:p>
+    <w:p>
+      <w:r>
+        <w:br w:type="page"/>
+      </w:r>
+    </w:p>
+    <w:p>
+      <w:pPr>
+        <w:pStyle w:val="Heading2"/>
+      </w:pPr>
+      <w:r>
+        <w:t>Additional Practice Problems by Topic</w:t>
+      </w:r>
+    </w:p>
+    <w:p>
+      <w:pPr>
+        <w:pStyle w:val="Heading3"/>
+      </w:pPr>
+      <w:r>
+        <w:t>KMT and States</w:t>
+      </w:r>
+    </w:p>
+    <w:p>
+      <w:pPr>
+        <w:pStyle w:val="ListParagraph"/>
+        <w:numPr>
+          <w:ilvl w:val="0"/>
+          <w:numId w:val="5"/>
+        </w:numPr>
+      </w:pPr>
+      <w:r>
+        <w:t>State the four central postulates of the kinetic-molecular theory for gases.</w:t>
+      </w:r>
+    </w:p>
+    <w:p>
+      <w:r>
+        <w:rPr>
+          <w:b/>
+          <w:i/>
+        </w:rPr>
+        <w:t xml:space="preserve">Solution: </w:t>
+      </w:r>
+      <w:r>
+        <w:t>(1) Gases consist of many small particles in random motion. (2) The volume of the particles is negligible compared with the volume of the container. (3) Particles exert no attractive or repulsive forces on each other. (4) Average kinetic energy of the particles is proportional to absolute temperature.</w:t>
+      </w:r>
+    </w:p>
+    <w:p>
+      <w:pPr>
+        <w:pStyle w:val="ListParagraph"/>
+        <w:numPr>
+          <w:ilvl w:val="0"/>
+          <w:numId w:val="5"/>
+        </w:numPr>
+      </w:pPr>
+      <w:r>
+        <w:t>Explain why a gas exerts pressure on the walls of its container.</w:t>
+      </w:r>
+    </w:p>
+    <w:p>
+      <w:r>
+        <w:rPr>
+          <w:b/>
+          <w:i/>
+        </w:rPr>
+        <w:t xml:space="preserve">Solution: </w:t>
+      </w:r>
+      <w:r>
+        <w:t>Gas particles strike the walls; each collision transfers momentum. The total force per unit area from many such collisions per second is the pressure.</w:t>
+      </w:r>
+    </w:p>
+    <w:p>
+      <w:pPr>
+        <w:pStyle w:val="ListParagraph"/>
+        <w:numPr>
+          <w:ilvl w:val="0"/>
+          <w:numId w:val="5"/>
+        </w:numPr>
+      </w:pPr>
+      <w:r>
+        <w:t>If the absolute temperature of a gas doubles, by what factor does the average kinetic energy change?</w:t>
+      </w:r>
+    </w:p>
+    <w:p>
+      <w:r>
+        <w:rPr>
+          <w:b/>
+          <w:i/>
+        </w:rPr>
+        <w:t xml:space="preserve">Solution: </w:t>
+      </w:r>
+      <w:r>
+        <w:t>Doubles. ⟨KE⟩ ∝ T.</w:t>
+      </w:r>
+    </w:p>
+    <w:p>
+      <w:pPr>
+        <w:pStyle w:val="ListParagraph"/>
+        <w:numPr>
+          <w:ilvl w:val="0"/>
+          <w:numId w:val="5"/>
+        </w:numPr>
+      </w:pPr>
+      <w:r>
+        <w:t>Order solid, liquid, and gas by typical particle separation and order/disorder.</w:t>
+      </w:r>
+    </w:p>
+    <w:p>
+      <w:r>
+        <w:rPr>
+          <w:b/>
+          <w:i/>
+        </w:rPr>
+        <w:t xml:space="preserve">Solution: </w:t>
+      </w:r>
+      <w:r>
+        <w:t>Particle separation: solid ≲ liquid ≪ gas. Order: solid (most ordered) &gt; liquid &gt; gas (most disordered).</w:t>
+      </w:r>
+    </w:p>
+    <w:p>
+      <w:pPr>
+        <w:pStyle w:val="ListParagraph"/>
+        <w:numPr>
+          <w:ilvl w:val="0"/>
+          <w:numId w:val="5"/>
+        </w:numPr>
+      </w:pPr>
+      <w:r>
+        <w:t>Why are gases highly compressible and liquids essentially incompressible?</w:t>
+      </w:r>
+    </w:p>
+    <w:p>
+      <w:r>
+        <w:rPr>
+          <w:b/>
+          <w:i/>
+        </w:rPr>
+        <w:t xml:space="preserve">Solution: </w:t>
+      </w:r>
+      <w:r>
+        <w:t>Gas particles are widely separated, so the empty space can be compressed. Liquid particles are already in contact; further compression must overcome strong short-range repulsions.</w:t>
+      </w:r>
+    </w:p>
+    <w:p>
+      <w:pPr>
+        <w:pStyle w:val="Heading3"/>
+      </w:pPr>
+      <w:r>
+        <w:t>Crystal Types</w:t>
+      </w:r>
+    </w:p>
+    <w:p>
+      <w:pPr>
+        <w:pStyle w:val="ListParagraph"/>
+        <w:numPr>
+          <w:ilvl w:val="0"/>
+          <w:numId w:val="6"/>
+        </w:numPr>
+      </w:pPr>
+      <w:r>
+        <w:t>Identify the crystal type of each: NaCl, diamond, Cu, ice, dry ice (CO₂).</w:t>
+      </w:r>
+    </w:p>
+    <w:p>
+      <w:r>
+        <w:rPr>
+          <w:b/>
+          <w:i/>
+        </w:rPr>
+        <w:t xml:space="preserve">Solution: </w:t>
+      </w:r>
+      <w:r>
+        <w:t>NaCl ionic; diamond covalent network; Cu metallic; ice molecular (H-bonded); dry ice molecular.</w:t>
+      </w:r>
+    </w:p>
+    <w:p>
+      <w:pPr>
+        <w:pStyle w:val="ListParagraph"/>
+        <w:numPr>
+          <w:ilvl w:val="0"/>
+          <w:numId w:val="6"/>
+        </w:numPr>
+      </w:pPr>
+      <w:r>
+        <w:t>Predict the relative melting points of an ionic crystal and a molecular crystal of similar molar mass.</w:t>
+      </w:r>
+    </w:p>
+    <w:p>
+      <w:r>
+        <w:rPr>
+          <w:b/>
+          <w:i/>
+        </w:rPr>
+        <w:t xml:space="preserve">Solution: </w:t>
+      </w:r>
+      <w:r>
+        <w:t>The ionic crystal melts much higher because Coulombic attractions among ions are far stronger than intermolecular forces in molecular solids.</w:t>
+      </w:r>
+    </w:p>
+    <w:p>
+      <w:pPr>
+        <w:pStyle w:val="ListParagraph"/>
+        <w:numPr>
+          <w:ilvl w:val="0"/>
+          <w:numId w:val="6"/>
+        </w:numPr>
+      </w:pPr>
+      <w:r>
+        <w:t>Why are metals typically good electrical conductors in the solid state, while ionic crystals are not?</w:t>
+      </w:r>
+    </w:p>
+    <w:p>
+      <w:r>
+        <w:rPr>
+          <w:b/>
+          <w:i/>
+        </w:rPr>
+        <w:t xml:space="preserve">Solution: </w:t>
+      </w:r>
+      <w:r>
+        <w:t>Metals have a delocalized “sea” of valence electrons free to move; ionic solids have ions locked in lattice positions, so charges cannot flow. Molten ionic compounds, however, do conduct.</w:t>
+      </w:r>
+    </w:p>
+    <w:p>
+      <w:pPr>
+        <w:pStyle w:val="ListParagraph"/>
+        <w:numPr>
+          <w:ilvl w:val="0"/>
+          <w:numId w:val="6"/>
+        </w:numPr>
+      </w:pPr>
+      <w:r>
+        <w:t>Explain why diamond is one of the hardest known substances.</w:t>
+      </w:r>
+    </w:p>
+    <w:p>
+      <w:r>
+        <w:rPr>
+          <w:b/>
+          <w:i/>
+        </w:rPr>
+        <w:t xml:space="preserve">Solution: </w:t>
+      </w:r>
+      <w:r>
+        <w:t>Each carbon atom is bonded covalently to four neighbors in a 3D network. Deforming the crystal requires breaking strong directional covalent bonds throughout the structure.</w:t>
+      </w:r>
+    </w:p>
+    <w:p>
+      <w:pPr>
+        <w:pStyle w:val="ListParagraph"/>
+        <w:numPr>
+          <w:ilvl w:val="0"/>
+          <w:numId w:val="6"/>
+        </w:numPr>
+      </w:pPr>
+      <w:r>
+        <w:t>A solid is brittle, has a high melting point, dissolves in water, and the solution conducts electricity. Identify the crystal type.</w:t>
+      </w:r>
+    </w:p>
+    <w:p>
+      <w:r>
+        <w:rPr>
+          <w:b/>
+          <w:i/>
+        </w:rPr>
+        <w:t xml:space="preserve">Solution: </w:t>
+      </w:r>
+      <w:r>
+        <w:t>Ionic. Brittleness, high m.p., water-solubility, and ionic conductivity in solution are signature properties.</w:t>
+      </w:r>
+    </w:p>
+    <w:p>
+      <w:pPr>
+        <w:pStyle w:val="Heading3"/>
+      </w:pPr>
+      <w:r>
+        <w:t>Liquid Properties</w:t>
+      </w:r>
+    </w:p>
+    <w:p>
+      <w:pPr>
+        <w:pStyle w:val="ListParagraph"/>
+        <w:numPr>
+          <w:ilvl w:val="0"/>
+          <w:numId w:val="7"/>
+        </w:numPr>
+      </w:pPr>
+      <w:r>
+        <w:t>Define surface tension and give an everyday example.</w:t>
+      </w:r>
+    </w:p>
+    <w:p>
+      <w:r>
+        <w:rPr>
+          <w:b/>
+          <w:i/>
+        </w:rPr>
+        <w:t xml:space="preserve">Solution: </w:t>
+      </w:r>
+      <w:r>
+        <w:t>Surface tension is the energy required to increase the surface area of a liquid (the inward pull on surface molecules). Example: water beads on a waxed surface; insects walk on water.</w:t>
+      </w:r>
+    </w:p>
+    <w:p>
+      <w:pPr>
+        <w:pStyle w:val="ListParagraph"/>
+        <w:numPr>
+          <w:ilvl w:val="0"/>
+          <w:numId w:val="7"/>
+        </w:numPr>
+      </w:pPr>
+      <w:r>
+        <w:t>Compare the viscosity of water and honey, and link the difference to intermolecular forces.</w:t>
+      </w:r>
+    </w:p>
+    <w:p>
+      <w:r>
+        <w:rPr>
+          <w:b/>
+          <w:i/>
+        </w:rPr>
+        <w:t xml:space="preserve">Solution: </w:t>
+      </w:r>
+      <w:r>
+        <w:t>Honey is much more viscous. Honey contains sugars that form many hydrogen bonds among large molecules, increasing internal resistance to flow.</w:t>
+      </w:r>
+    </w:p>
+    <w:p>
+      <w:pPr>
+        <w:pStyle w:val="ListParagraph"/>
+        <w:numPr>
+          <w:ilvl w:val="0"/>
+          <w:numId w:val="7"/>
+        </w:numPr>
+      </w:pPr>
+      <w:r>
+        <w:t>Explain capillary action in a thin glass tube of water.</w:t>
+      </w:r>
+    </w:p>
+    <w:p>
+      <w:r>
+        <w:rPr>
+          <w:b/>
+          <w:i/>
+        </w:rPr>
+        <w:t xml:space="preserve">Solution: </w:t>
+      </w:r>
+      <w:r>
+        <w:t>Adhesive forces between water and glass exceed cohesive forces among water molecules. Water climbs the tube against gravity until adhesion balances the weight of the column.</w:t>
+      </w:r>
+    </w:p>
+    <w:p>
+      <w:pPr>
+        <w:pStyle w:val="ListParagraph"/>
+        <w:numPr>
+          <w:ilvl w:val="0"/>
+          <w:numId w:val="7"/>
+        </w:numPr>
+      </w:pPr>
+      <w:r>
+        <w:t>Why does water have a higher boiling point than methane (CH₄), although both have similar molar mass?</w:t>
+      </w:r>
+    </w:p>
+    <w:p>
+      <w:r>
+        <w:rPr>
+          <w:b/>
+          <w:i/>
+        </w:rPr>
+        <w:t xml:space="preserve">Solution: </w:t>
+      </w:r>
+      <w:r>
+        <w:t>Water hydrogen-bonds; methane has only weak London dispersion forces. Stronger intermolecular forces in water raise its boiling point dramatically.</w:t>
+      </w:r>
+    </w:p>
+    <w:p>
+      <w:pPr>
+        <w:pStyle w:val="ListParagraph"/>
+        <w:numPr>
+          <w:ilvl w:val="0"/>
+          <w:numId w:val="7"/>
+        </w:numPr>
+      </w:pPr>
+      <w:r>
+        <w:t>Define vapor pressure of a liquid.</w:t>
+      </w:r>
+    </w:p>
+    <w:p>
+      <w:r>
+        <w:rPr>
+          <w:b/>
+          <w:i/>
+        </w:rPr>
+        <w:t xml:space="preserve">Solution: </w:t>
+      </w:r>
+      <w:r>
+        <w:t>The pressure exerted by the vapor in equilibrium with its liquid at a given temperature. It increases with temperature and depends on the strength of intermolecular forces.</w:t>
+      </w:r>
+    </w:p>
+    <w:p>
+      <w:pPr>
+        <w:pStyle w:val="Heading3"/>
+      </w:pPr>
+      <w:r>
+        <w:t>Intermolecular Forces</w:t>
+      </w:r>
+    </w:p>
+    <w:p>
+      <w:pPr>
+        <w:pStyle w:val="ListParagraph"/>
+        <w:numPr>
+          <w:ilvl w:val="0"/>
+          <w:numId w:val="8"/>
+        </w:numPr>
+      </w:pPr>
+      <w:r>
+        <w:t>Identify the dominant IMF in: CH₄, HF, CH₃OH, NaCl, Ne.</w:t>
+      </w:r>
+    </w:p>
+    <w:p>
+      <w:r>
+        <w:rPr>
+          <w:b/>
+          <w:i/>
+        </w:rPr>
+        <w:t xml:space="preserve">Solution: </w:t>
+      </w:r>
+      <w:r>
+        <w:t>CH₄ dispersion; HF hydrogen bonding (and dipole–dipole, dispersion); CH₃OH hydrogen bonding; NaCl ionic forces (not strictly an IMF — a solid lattice); Ne dispersion.</w:t>
+      </w:r>
+    </w:p>
+    <w:p>
+      <w:pPr>
+        <w:pStyle w:val="ListParagraph"/>
+        <w:numPr>
+          <w:ilvl w:val="0"/>
+          <w:numId w:val="8"/>
+        </w:numPr>
+      </w:pPr>
+      <w:r>
+        <w:t>Rank in order of increasing boiling point: CH₄, CH₃OH, H₂O.</w:t>
+      </w:r>
+    </w:p>
+    <w:p>
+      <w:r>
+        <w:rPr>
+          <w:b/>
+          <w:i/>
+        </w:rPr>
+        <w:t xml:space="preserve">Solution: </w:t>
+      </w:r>
+      <w:r>
+        <w:t>CH₄ (−161 °C) &lt; CH₃OH (65 °C) &lt; H₂O (100 °C). Water hydrogen-bonds with two donors and two acceptors per molecule, beating methanol.</w:t>
+      </w:r>
+    </w:p>
+    <w:p>
+      <w:pPr>
+        <w:pStyle w:val="ListParagraph"/>
+        <w:numPr>
+          <w:ilvl w:val="0"/>
+          <w:numId w:val="8"/>
+        </w:numPr>
+      </w:pPr>
+      <w:r>
+        <w:t>Explain why noble gas boiling points increase from He to Xe.</w:t>
+      </w:r>
+    </w:p>
+    <w:p>
+      <w:r>
+        <w:rPr>
+          <w:b/>
+          <w:i/>
+        </w:rPr>
+        <w:t xml:space="preserve">Solution: </w:t>
+      </w:r>
+      <w:r>
+        <w:t>Larger atoms have more electrons and more polarizable clouds, so London dispersion forces grow stronger down the group, raising boiling points.</w:t>
+      </w:r>
+    </w:p>
+    <w:p>
+      <w:pPr>
+        <w:pStyle w:val="ListParagraph"/>
+        <w:numPr>
+          <w:ilvl w:val="0"/>
+          <w:numId w:val="8"/>
+        </w:numPr>
+      </w:pPr>
+      <w:r>
+        <w:t>Which has a higher boiling point: HBr or HCl? Explain.</w:t>
+      </w:r>
+    </w:p>
+    <w:p>
+      <w:r>
+        <w:rPr>
+          <w:b/>
+          <w:i/>
+        </w:rPr>
+        <w:t xml:space="preserve">Solution: </w:t>
+      </w:r>
+      <w:r>
+        <w:t>HBr. Both are dipole–dipole, but HBr has more electrons and larger dispersion forces, dominating the slightly larger H—X dipole of HCl.</w:t>
+      </w:r>
+    </w:p>
+    <w:p>
+      <w:pPr>
+        <w:pStyle w:val="ListParagraph"/>
+        <w:numPr>
+          <w:ilvl w:val="0"/>
+          <w:numId w:val="8"/>
+        </w:numPr>
+      </w:pPr>
+      <w:r>
+        <w:t>Why is CHCl₃ a higher-boiling liquid than CH₄ of similar molar mass family?</w:t>
+      </w:r>
+    </w:p>
+    <w:p>
+      <w:r>
+        <w:rPr>
+          <w:b/>
+          <w:i/>
+        </w:rPr>
+        <w:t xml:space="preserve">Solution: </w:t>
+      </w:r>
+      <w:r>
+        <w:t>CHCl₃ has a permanent dipole (polar) and large dispersion forces from many electrons. CH₄ is nonpolar with much smaller dispersion forces.</w:t>
+      </w:r>
+    </w:p>
+    <w:p>
+      <w:pPr>
+        <w:pStyle w:val="Heading3"/>
+      </w:pPr>
+      <w:r>
+        <w:t>Vapor Pressure and Boiling</w:t>
+      </w:r>
+    </w:p>
+    <w:p>
+      <w:pPr>
+        <w:pStyle w:val="ListParagraph"/>
+        <w:numPr>
+          <w:ilvl w:val="0"/>
+          <w:numId w:val="9"/>
+        </w:numPr>
+      </w:pPr>
+      <w:r>
+        <w:t>Define the boiling point of a liquid in terms of vapor pressure.</w:t>
+      </w:r>
+    </w:p>
+    <w:p>
+      <w:r>
+        <w:rPr>
+          <w:b/>
+          <w:i/>
+        </w:rPr>
+        <w:t xml:space="preserve">Solution: </w:t>
+      </w:r>
+      <w:r>
+        <w:t>The temperature at which the liquid’s vapor pressure equals the external (atmospheric) pressure.</w:t>
+      </w:r>
+    </w:p>
+    <w:p>
+      <w:pPr>
+        <w:pStyle w:val="ListParagraph"/>
+        <w:numPr>
+          <w:ilvl w:val="0"/>
+          <w:numId w:val="9"/>
+        </w:numPr>
+      </w:pPr>
+      <w:r>
+        <w:t>Why does water boil at a lower temperature on a high mountain?</w:t>
+      </w:r>
+    </w:p>
+    <w:p>
+      <w:r>
+        <w:rPr>
+          <w:b/>
+          <w:i/>
+        </w:rPr>
+        <w:t xml:space="preserve">Solution: </w:t>
+      </w:r>
+      <w:r>
+        <w:t>Atmospheric pressure is lower at altitude, so the vapor pressure required to match it is reached at a lower temperature.</w:t>
+      </w:r>
+    </w:p>
+    <w:p>
+      <w:pPr>
+        <w:pStyle w:val="ListParagraph"/>
+        <w:numPr>
+          <w:ilvl w:val="0"/>
+          <w:numId w:val="9"/>
+        </w:numPr>
+      </w:pPr>
+      <w:r>
+        <w:t>Predict whether ethanol or water has the higher vapor pressure at 25 °C, given that ethanol’s boiling point (78 °C) is below water’s (100 °C).</w:t>
+      </w:r>
+    </w:p>
+    <w:p>
+      <w:r>
+        <w:rPr>
+          <w:b/>
+          <w:i/>
+        </w:rPr>
+        <w:t xml:space="preserve">Solution: </w:t>
+      </w:r>
+      <w:r>
+        <w:t>Ethanol. Lower boiling point means higher vapor pressure at any given temperature — ethanol’s intermolecular forces are weaker than water’s.</w:t>
+      </w:r>
+    </w:p>
+    <w:p>
+      <w:pPr>
+        <w:pStyle w:val="ListParagraph"/>
+        <w:numPr>
+          <w:ilvl w:val="0"/>
+          <w:numId w:val="9"/>
+        </w:numPr>
+      </w:pPr>
+      <w:r>
+        <w:t>Explain why a pressure cooker speeds up cooking.</w:t>
+      </w:r>
+    </w:p>
+    <w:p>
+      <w:r>
+        <w:rPr>
+          <w:b/>
+          <w:i/>
+        </w:rPr>
+        <w:t xml:space="preserve">Solution: </w:t>
+      </w:r>
+      <w:r>
+        <w:t>Sealed pressure rises; water boils at a higher temperature (e.g., ≈120 °C at 2 atm). Hotter water cooks foods faster.</w:t>
+      </w:r>
+    </w:p>
+    <w:p>
+      <w:pPr>
+        <w:pStyle w:val="ListParagraph"/>
+        <w:numPr>
+          <w:ilvl w:val="0"/>
+          <w:numId w:val="9"/>
+        </w:numPr>
+      </w:pPr>
+      <w:r>
+        <w:t>If a liquid’s vapor pressure at 50 °C is 250 mmHg, will it boil at 50 °C and standard atmospheric pressure (760 mmHg)? Explain.</w:t>
+      </w:r>
+    </w:p>
+    <w:p>
+      <w:r>
+        <w:rPr>
+          <w:b/>
+          <w:i/>
+        </w:rPr>
+        <w:t xml:space="preserve">Solution: </w:t>
+      </w:r>
+      <w:r>
+        <w:t>No. Boiling occurs only when vapor pressure equals atmospheric pressure (760 mmHg). At 50 °C the vapor pressure is far below that, so it only evaporates.</w:t>
+      </w:r>
+    </w:p>
+    <w:p>
+      <w:pPr>
+        <w:pStyle w:val="Heading3"/>
+      </w:pPr>
+      <w:r>
+        <w:t>Specific Heat</w:t>
+      </w:r>
+    </w:p>
+    <w:p>
+      <w:pPr>
+        <w:pStyle w:val="ListParagraph"/>
+        <w:numPr>
+          <w:ilvl w:val="0"/>
+          <w:numId w:val="10"/>
+        </w:numPr>
+      </w:pPr>
+      <w:r>
+        <w:t>How much heat is required to raise 100.0 g of water from 25.0 °C to 75.0 °C? (c = 4.184 J/g·°C.)</w:t>
+      </w:r>
+    </w:p>
+    <w:p>
+      <w:r>
+        <w:rPr>
+          <w:b/>
+        </w:rPr>
+        <w:t xml:space="preserve">Solution: </w:t>
+      </w:r>
+      <w:r>
+        <w:t xml:space="preserve">q = m × c × ΔT = 100.0 </w:t>
+      </w:r>
+      <w:r>
+        <w:rPr>
+          <w:strike w:val="true"/>
+        </w:rPr>
+        <w:t>g</w:t>
+      </w:r>
+      <w:r>
+        <w:t xml:space="preserve"> × (4.184 J / 1 </w:t>
+      </w:r>
+      <w:r>
+        <w:rPr>
+          <w:strike w:val="true"/>
+        </w:rPr>
+        <w:t>g</w:t>
+      </w:r>
+      <w:r>
+        <w:t>·</w:t>
+      </w:r>
+      <w:r>
+        <w:rPr>
+          <w:strike w:val="true"/>
+        </w:rPr>
+        <w:t>°C</w:t>
+      </w:r>
+      <w:r>
+        <w:t xml:space="preserve">) × 50.0 </w:t>
+      </w:r>
+      <w:r>
+        <w:rPr>
+          <w:strike w:val="true"/>
+        </w:rPr>
+        <w:t>°C</w:t>
+      </w:r>
+      <w:r>
+        <w:t xml:space="preserve"> = 20,920 J = 20.9 kJ</w:t>
+      </w:r>
+    </w:p>
+    <w:p>
+      <w:r>
+        <w:rPr>
+          <w:i/>
+        </w:rPr>
+        <w:t>"g" / "°C" cancel in the standard q = mcΔT chain, leaving energy in joules.</w:t>
+      </w:r>
+    </w:p>
+    <w:p>
+      <w:pPr>
+        <w:pStyle w:val="ListParagraph"/>
+        <w:numPr>
+          <w:ilvl w:val="0"/>
+          <w:numId w:val="10"/>
+        </w:numPr>
+      </w:pPr>
+      <w:r>
+        <w:t>A 50.0 g block of metal absorbs 1.20 kJ as it heats from 20.0 to 84.0 °C. Compute c.</w:t>
+      </w:r>
+    </w:p>
+    <w:p>
+      <w:r>
+        <w:rPr>
+          <w:b/>
+        </w:rPr>
+        <w:t xml:space="preserve">Solution: </w:t>
+      </w:r>
+      <w:r>
+        <w:t>ΔT = 84.0 − 20.0 = 64.0 °C</w:t>
+      </w:r>
+    </w:p>
+    <w:p>
+      <w:r>
+        <w:t xml:space="preserve">c = q / (m × ΔT) = 1200 J / (50.0 </w:t>
+      </w:r>
+      <w:r>
+        <w:rPr>
+          <w:strike w:val="true"/>
+        </w:rPr>
+        <w:t>g</w:t>
+      </w:r>
+      <w:r>
+        <w:t xml:space="preserve"> × 64.0 </w:t>
+      </w:r>
+      <w:r>
+        <w:rPr>
+          <w:strike w:val="true"/>
+        </w:rPr>
+        <w:t>°C</w:t>
+      </w:r>
+      <w:r>
+        <w:t>) = 1200 / 3200 = 0.375 J/(</w:t>
+      </w:r>
+      <w:r>
+        <w:rPr>
+          <w:strike w:val="true"/>
+        </w:rPr>
+        <w:t>g</w:t>
+      </w:r>
+      <w:r>
+        <w:t>·</w:t>
+      </w:r>
+      <w:r>
+        <w:rPr>
+          <w:strike w:val="true"/>
+        </w:rPr>
+        <w:t>°C</w:t>
+      </w:r>
+      <w:r>
+        <w:t>)</w:t>
+      </w:r>
+    </w:p>
+    <w:p>
+      <w:r>
+        <w:t>Wait — the cancellation here is the reverse: "g" and "°C" appear in the DENOMINATOR, so they survive into the unit of c (J/g·°C). Final: c = 0.375 J/(g·°C)</w:t>
+      </w:r>
+    </w:p>
+    <w:p>
+      <w:r>
+        <w:rPr>
+          <w:i/>
+        </w:rPr>
+        <w:t>Solving q = mcΔT for c: divide both sides by m × ΔT. The "g" and "°C" in the denominator do NOT cancel against anything — they become part of the units of c (J per gram per degree).</w:t>
+      </w:r>
+    </w:p>
+    <w:p>
+      <w:pPr>
+        <w:pStyle w:val="ListParagraph"/>
+        <w:numPr>
+          <w:ilvl w:val="0"/>
+          <w:numId w:val="10"/>
+        </w:numPr>
+      </w:pPr>
+      <w:r>
+        <w:t>Why does water make a good coolant?</w:t>
+      </w:r>
+    </w:p>
+    <w:p>
+      <w:r>
+        <w:rPr>
+          <w:b/>
+          <w:i/>
+        </w:rPr>
+        <w:t xml:space="preserve">Solution: </w:t>
+      </w:r>
+      <w:r>
+        <w:t>Water has an unusually high specific heat (4.184 J/g·°C) and high heat of vaporization, so it absorbs a great deal of heat per gram for modest temperature change.</w:t>
+      </w:r>
+    </w:p>
+    <w:p>
+      <w:pPr>
+        <w:pStyle w:val="ListParagraph"/>
+        <w:numPr>
+          <w:ilvl w:val="0"/>
+          <w:numId w:val="10"/>
+        </w:numPr>
+      </w:pPr>
+      <w:r>
+        <w:t>How many joules to raise the temperature of 250 g of aluminum (c = 0.897 J/g·°C) by 30.0 °C?</w:t>
+      </w:r>
+    </w:p>
+    <w:p>
+      <w:r>
+        <w:rPr>
+          <w:b/>
+        </w:rPr>
+        <w:t xml:space="preserve">Solution: </w:t>
+      </w:r>
+      <w:r>
+        <w:t xml:space="preserve">q = m × c × ΔT = 250 </w:t>
+      </w:r>
+      <w:r>
+        <w:rPr>
+          <w:strike w:val="true"/>
+        </w:rPr>
+        <w:t>g</w:t>
+      </w:r>
+      <w:r>
+        <w:t xml:space="preserve"> × (0.897 J / 1 </w:t>
+      </w:r>
+      <w:r>
+        <w:rPr>
+          <w:strike w:val="true"/>
+        </w:rPr>
+        <w:t>g</w:t>
+      </w:r>
+      <w:r>
+        <w:t>·</w:t>
+      </w:r>
+      <w:r>
+        <w:rPr>
+          <w:strike w:val="true"/>
+        </w:rPr>
+        <w:t>°C</w:t>
+      </w:r>
+      <w:r>
+        <w:t xml:space="preserve">) × 30.0 </w:t>
+      </w:r>
+      <w:r>
+        <w:rPr>
+          <w:strike w:val="true"/>
+        </w:rPr>
+        <w:t>°C</w:t>
+      </w:r>
+      <w:r>
+        <w:t xml:space="preserve"> = 6728 J ≈ 6.73 kJ</w:t>
+      </w:r>
+    </w:p>
+    <w:p>
+      <w:r>
+        <w:rPr>
+          <w:i/>
+        </w:rPr>
+        <w:t>"g" and "°C" cancel; result is in joules. Three sig figs.</w:t>
+      </w:r>
+    </w:p>
+    <w:p>
+      <w:pPr>
+        <w:pStyle w:val="ListParagraph"/>
+        <w:numPr>
+          <w:ilvl w:val="0"/>
+          <w:numId w:val="10"/>
+        </w:numPr>
+      </w:pPr>
+      <w:r>
+        <w:t>If 500.0 J is added to 25.0 g of copper (c = 0.385 J/g·°C) at 22.0 °C, what is the final T?</w:t>
+      </w:r>
+    </w:p>
+    <w:p>
+      <w:r>
+        <w:rPr>
+          <w:b/>
+        </w:rPr>
+        <w:t xml:space="preserve">Solution: </w:t>
+      </w:r>
+      <w:r>
+        <w:t xml:space="preserve">ΔT = q / (m × c) = 500.0 </w:t>
+      </w:r>
+      <w:r>
+        <w:rPr>
+          <w:strike w:val="true"/>
+        </w:rPr>
+        <w:t>J</w:t>
+      </w:r>
+      <w:r>
+        <w:t xml:space="preserve"> / (25.0 </w:t>
+      </w:r>
+      <w:r>
+        <w:rPr>
+          <w:strike w:val="true"/>
+        </w:rPr>
+        <w:t>g</w:t>
+      </w:r>
+      <w:r>
+        <w:t xml:space="preserve"> × (0.385 </w:t>
+      </w:r>
+      <w:r>
+        <w:rPr>
+          <w:strike w:val="true"/>
+        </w:rPr>
+        <w:t>J</w:t>
+      </w:r>
+      <w:r>
+        <w:t xml:space="preserve"> / 1 </w:t>
+      </w:r>
+      <w:r>
+        <w:rPr>
+          <w:strike w:val="true"/>
+        </w:rPr>
+        <w:t>g</w:t>
+      </w:r>
+      <w:r>
+        <w:t>·°C)) = 500.0 / 9.625 = 51.95 °C</w:t>
+      </w:r>
+    </w:p>
+    <w:p>
+      <w:r>
+        <w:t>T_f = T_i + ΔT = 22.0 + 51.95 = 74.0 °C</w:t>
+      </w:r>
+    </w:p>
+    <w:p>
+      <w:r>
+        <w:rPr>
+          <w:i/>
+        </w:rPr>
+        <w:t>"J" and "g" cancel in the ΔT calculation, leaving °C. The final temperature is the initial temperature plus the rise.</w:t>
+      </w:r>
+    </w:p>
+    <w:p>
+      <w:pPr>
+        <w:pStyle w:val="Heading3"/>
+      </w:pPr>
+      <w:r>
+        <w:t>Anomalies of Water</w:t>
+      </w:r>
+    </w:p>
+    <w:p>
+      <w:pPr>
+        <w:pStyle w:val="ListParagraph"/>
+        <w:numPr>
+          <w:ilvl w:val="0"/>
+          <w:numId w:val="11"/>
+        </w:numPr>
+      </w:pPr>
+      <w:r>
+        <w:t>State two ways in which water’s solid form (ice) is anomalous compared with most substances.</w:t>
+      </w:r>
+    </w:p>
+    <w:p>
+      <w:r>
+        <w:rPr>
+          <w:b/>
+          <w:i/>
+        </w:rPr>
+        <w:t xml:space="preserve">Solution: </w:t>
+      </w:r>
+      <w:r>
+        <w:t>(1) Ice is less dense than liquid water, so it floats. (2) Most solids are denser than their liquid forms; ice’s open hydrogen-bonded lattice is the exception.</w:t>
+      </w:r>
+    </w:p>
+    <w:p>
+      <w:pPr>
+        <w:pStyle w:val="ListParagraph"/>
+        <w:numPr>
+          <w:ilvl w:val="0"/>
+          <w:numId w:val="11"/>
+        </w:numPr>
+      </w:pPr>
+      <w:r>
+        <w:t>Why is the density anomaly of water important for aquatic life?</w:t>
+      </w:r>
+    </w:p>
+    <w:p>
+      <w:r>
+        <w:rPr>
+          <w:b/>
+          <w:i/>
+        </w:rPr>
+        <w:t xml:space="preserve">Solution: </w:t>
+      </w:r>
+      <w:r>
+        <w:t>Ice forms a floating insulating layer. Liquid water at 4 °C (its maximum density) sinks below the ice, allowing aquatic organisms to survive winter at the bottom.</w:t>
+      </w:r>
+    </w:p>
+    <w:p>
+      <w:pPr>
+        <w:pStyle w:val="ListParagraph"/>
+        <w:numPr>
+          <w:ilvl w:val="0"/>
+          <w:numId w:val="11"/>
+        </w:numPr>
+      </w:pPr>
+      <w:r>
+        <w:t>Why does water have such a high boiling point compared with H₂S, H₂Se, and H₂Te?</w:t>
+      </w:r>
+    </w:p>
+    <w:p>
+      <w:r>
+        <w:rPr>
+          <w:b/>
+          <w:i/>
+        </w:rPr>
+        <w:t xml:space="preserve">Solution: </w:t>
+      </w:r>
+      <w:r>
+        <w:t>Hydrogen bonding. The strong O—H ··· O network in water requires much more energy to disrupt than the dipole–dipole + dispersion forces in heavier-chalcogen hydrides.</w:t>
+      </w:r>
+    </w:p>
+    <w:p>
+      <w:pPr>
+        <w:pStyle w:val="ListParagraph"/>
+        <w:numPr>
+          <w:ilvl w:val="0"/>
+          <w:numId w:val="11"/>
+        </w:numPr>
+      </w:pPr>
+      <w:r>
+        <w:t>Explain why water has unusually high specific heat compared with most liquids.</w:t>
+      </w:r>
+    </w:p>
+    <w:p>
+      <w:r>
+        <w:rPr>
+          <w:b/>
+          <w:i/>
+        </w:rPr>
+        <w:t xml:space="preserve">Solution: </w:t>
+      </w:r>
+      <w:r>
+        <w:t>A large fraction of input energy goes into stretching/breaking hydrogen bonds and increasing molecular motion within the H-bonded network, not just translational kinetic energy.</w:t>
+      </w:r>
+    </w:p>
+    <w:p>
+      <w:pPr>
+        <w:pStyle w:val="ListParagraph"/>
+        <w:numPr>
+          <w:ilvl w:val="0"/>
+          <w:numId w:val="11"/>
+        </w:numPr>
+      </w:pPr>
+      <w:r>
+        <w:t>Why is hot water poured on ice an effective de-icer in some situations but not in very cold weather?</w:t>
+      </w:r>
+    </w:p>
+    <w:p>
+      <w:r>
+        <w:rPr>
+          <w:b/>
+          <w:i/>
+        </w:rPr>
+        <w:t xml:space="preserve">Solution: </w:t>
+      </w:r>
+      <w:r>
+        <w:t>Hot water transfers heat to melt ice quickly. In very cold weather (well below 0 °C), the meltwater quickly refreezes, often producing a more dangerous slick of fresh ice.</w:t>
+      </w:r>
+    </w:p>
+    <w:p>
+      <w:pPr>
+        <w:pStyle w:val="Heading2"/>
+      </w:pPr>
+      <w:r>
+        <w:rPr>
+          <w:b/>
+          <w:bCs/>
+        </w:rPr>
+        <w:t xml:space="preserve">Multi-Concept Problems</w:t>
+      </w:r>
+    </w:p>
+    <w:p>
+      <w:pPr>
+        <w:pStyle w:val="ListParagraph"/>
+        <w:spacing w:after="80" w:line="300"/>
+        <w:numPr>
+          <w:ilvl w:val="0"/>
+          <w:numId w:val="13"/>
+        </w:numPr>
+      </w:pPr>
+      <w:r>
+        <w:rPr>
+          <w:b/>
+          <w:bCs/>
+        </w:rPr>
+        <w:t xml:space="preserve"/>
+      </w:r>
+      <w:r>
+        <w:t xml:space="preserve">An athlete sweats out 0.500 L of water during a workout. </w:t>
+      </w:r>
+    </w:p>
+    <w:p>
+      <w:pPr>
+        <w:pStyle w:val="ListParagraph"/>
+        <w:numPr>
+          <w:ilvl w:val="0"/>
+          <w:numId w:val="22"/>
+        </w:numPr>
+      </w:pPr>
+      <w:r>
+        <w:t xml:space="preserve">Mass of water? </w:t>
+      </w:r>
+    </w:p>
+    <w:p>
+      <w:pPr>
+        <w:pStyle w:val="ListParagraph"/>
+        <w:numPr>
+          <w:ilvl w:val="0"/>
+          <w:numId w:val="22"/>
+        </w:numPr>
+      </w:pPr>
+      <w:r>
+        <w:t xml:space="preserve">If all of it evaporates from the skin (Δ_vap H = 40.7 kJ/mol at 100 °C; about 44 kJ/mol at body temperature), how much heat is removed from the body?</w:t>
+      </w:r>
+    </w:p>
+    <w:p>
+      <w:pPr>
+        <w:spacing w:after="160" w:line="300"/>
+        <w:ind w:left="360"/>
+      </w:pPr>
+      <w:r>
+        <w:rPr>
+          <w:b/>
+        </w:rPr>
+        <w:t xml:space="preserve">Solution: </w:t>
+      </w:r>
+      <w:r>
+        <w:t xml:space="preserve">Mass = 0.500 </w:t>
+      </w:r>
+      <w:r>
+        <w:rPr>
+          <w:strike w:val="true"/>
+        </w:rPr>
+        <w:t>L</w:t>
+      </w:r>
+      <w:r>
+        <w:t xml:space="preserve"> × (1000 </w:t>
+      </w:r>
+      <w:r>
+        <w:rPr>
+          <w:strike w:val="true"/>
+        </w:rPr>
+        <w:t>mL</w:t>
+      </w:r>
+      <w:r>
+        <w:t xml:space="preserve"> / 1 </w:t>
+      </w:r>
+      <w:r>
+        <w:rPr>
+          <w:strike w:val="true"/>
+        </w:rPr>
+        <w:t>L</w:t>
+      </w:r>
+      <w:r>
+        <w:t xml:space="preserve">) × (1.00 g / 1 </w:t>
+      </w:r>
+      <w:r>
+        <w:rPr>
+          <w:strike w:val="true"/>
+        </w:rPr>
+        <w:t>mL</w:t>
+      </w:r>
+      <w:r>
+        <w:t>) = 500. g</w:t>
+      </w:r>
+    </w:p>
+    <w:p>
+      <w:pPr>
+        <w:spacing w:after="160" w:line="300"/>
+        <w:ind w:left="360"/>
+      </w:pPr>
+      <w:r>
+        <w:t xml:space="preserve">n = 500. </w:t>
+      </w:r>
+      <w:r>
+        <w:rPr>
+          <w:strike w:val="true"/>
+        </w:rPr>
+        <w:t>g</w:t>
+      </w:r>
+      <w:r>
+        <w:t xml:space="preserve"> × (1 mol / 18.015 </w:t>
+      </w:r>
+      <w:r>
+        <w:rPr>
+          <w:strike w:val="true"/>
+        </w:rPr>
+        <w:t>g</w:t>
+      </w:r>
+      <w:r>
+        <w:t>) = 27.75 mol H₂O</w:t>
+      </w:r>
+    </w:p>
+    <w:p>
+      <w:pPr>
+        <w:spacing w:after="160" w:line="300"/>
+        <w:ind w:left="360"/>
+      </w:pPr>
+      <w:r>
+        <w:t xml:space="preserve">Heat removed = 27.75 </w:t>
+      </w:r>
+      <w:r>
+        <w:rPr>
+          <w:strike w:val="true"/>
+        </w:rPr>
+        <w:t>mol</w:t>
+      </w:r>
+      <w:r>
+        <w:t xml:space="preserve"> × (44 kJ / 1 </w:t>
+      </w:r>
+      <w:r>
+        <w:rPr>
+          <w:strike w:val="true"/>
+        </w:rPr>
+        <w:t>mol</w:t>
+      </w:r>
+      <w:r>
+        <w:t>) = 1221 kJ ≈ 1.2 × 10³ kJ</w:t>
+      </w:r>
+    </w:p>
+    <w:p>
+      <w:pPr>
+        <w:spacing w:after="160" w:line="300"/>
+        <w:ind w:left="360"/>
+      </w:pPr>
+      <w:r>
+        <w:rPr>
+          <w:i/>
+        </w:rPr>
+        <w:t>Cancellations: "L" → "mL" (volume to mass via density); "g" (mass to moles via molar mass); "mol" (moles to energy via heat of vaporization). At ~44 kJ/mol, evaporative cooling can lower body temperature by several degrees if the sweat is not replaced.</w:t>
       </w:r>
     </w:p>
     <w:p>

</xml_diff>